<commit_message>
New pop uo in my dojo v1
</commit_message>
<xml_diff>
--- a/Leadership_OS_Documentation_vCURRENT.docx
+++ b/Leadership_OS_Documentation_vCURRENT.docx
@@ -26,7 +26,7 @@
           <w:color w:val="555555"/>
           <w:sz w:val="26"/>
         </w:rPr>
-        <w:t>Current Product and Technical Documentation | Version 6.4</w:t>
+        <w:t>Current Product and Technical Documentation | Version 6.5</w:t>
       </w:r>
     </w:p>
     <w:p>
@@ -34,7 +34,7 @@
         <w:spacing w:after="120"/>
       </w:pPr>
       <w:r>
-        <w:t>Alfred is an executive operating system for leaders. It combines AI coaching, task execution, goals, habits, people review, journaling, message intelligence, notifications, admin operations, and Journey 2.0 leadership development.</w:t>
+        <w:t>Alfred is an executive operating system for leaders. It combines AI coaching, task execution, goals, projects, meeting intelligence, habits, people review, journaling, notifications, admin operations, and Journey 2.0 leadership development.</w:t>
       </w:r>
     </w:p>
     <w:tbl>
@@ -339,7 +339,7 @@
         <w:spacing w:after="120"/>
       </w:pPr>
       <w:r>
-        <w:t>The current product combines conversational AI, task and habit execution, goal management, transformation roadmapping, people review, journaling, priority review, notifications, and leadership coaching. Journey 2.0 is the central development engine, using domains, subdomains, belts, trials, assessments, and behavioral evidence rather than a static reflection wheel.</w:t>
+        <w:t>The current product combines conversational AI, task and habit execution, goal and project management, meeting intelligence, transformation roadmapping, people review, journaling, priority review, notifications, and leadership coaching. Journey 2.0 is the central development engine, using domains, subdomains, belts, trials, assessments, and behavioral evidence rather than a static reflection wheel.</w:t>
       </w:r>
     </w:p>
     <w:p>
@@ -495,7 +495,7 @@
         <w:spacing w:after="80"/>
       </w:pPr>
       <w:r>
-        <w:t>Tasks include MTN prioritization, linked goals, recurring metadata, postpone tracking, completion timestamps, and trend views.</w:t>
+        <w:t>Tasks include MTN prioritization, linked goals, recurring metadata, postpone tracking, completion timestamps, list/calendar modes, drag-and-drop scheduling, bounded MTN history, and day/week/month views.</w:t>
       </w:r>
     </w:p>
     <w:p>
@@ -779,16 +779,8 @@
             <w:vAlign w:val="center"/>
           </w:tcPr>
           <w:p>
-            <w:pPr>
-              <w:spacing w:after="0"/>
-              <w:jc w:val="left"/>
-            </w:pPr>
             <w:r>
-              <w:rPr>
-                <w:b w:val="0"/>
-                <w:sz w:val="20"/>
-              </w:rPr>
-              <w:t>Tasks/Priority</w:t>
+              <w:t>Tasks/Priority/Calendar</w:t>
             </w:r>
           </w:p>
         </w:tc>
@@ -798,16 +790,8 @@
             <w:vAlign w:val="center"/>
           </w:tcPr>
           <w:p>
-            <w:pPr>
-              <w:spacing w:after="0"/>
-              <w:jc w:val="left"/>
-            </w:pPr>
             <w:r>
-              <w:rPr>
-                <w:b w:val="0"/>
-                <w:sz w:val="20"/>
-              </w:rPr>
-              <w:t>Task CRUD, filters, MTN trends, recurring/postpone behavior, priority review, recommendations, decisions, feedback, and learning insights.</w:t>
+              <w:t>Task CRUD, filters, MTN trends/history, calendar scheduling, recurring/postpone behavior, priority review, recommendations, decisions, feedback, and learning insights.</w:t>
             </w:r>
           </w:p>
         </w:tc>
@@ -819,16 +803,8 @@
             <w:vAlign w:val="center"/>
           </w:tcPr>
           <w:p>
-            <w:pPr>
-              <w:spacing w:after="0"/>
-              <w:jc w:val="left"/>
-            </w:pPr>
             <w:r>
-              <w:rPr>
-                <w:b w:val="0"/>
-                <w:sz w:val="20"/>
-              </w:rPr>
-              <w:t>Habits/Journal/Coaching</w:t>
+              <w:t>Meetings/Habits/Journal/Coaching</w:t>
             </w:r>
           </w:p>
         </w:tc>
@@ -838,16 +814,8 @@
             <w:vAlign w:val="center"/>
           </w:tcPr>
           <w:p>
-            <w:pPr>
-              <w:spacing w:after="0"/>
-              <w:jc w:val="left"/>
-            </w:pPr>
             <w:r>
-              <w:rPr>
-                <w:b w:val="0"/>
-                <w:sz w:val="20"/>
-              </w:rPr>
-              <w:t>Habit tracking, energy check-ins, coaching refresh, journal CRUD/trends, reflection-depth backfill, and leadership coaching sessions.</w:t>
+              <w:t>Meeting capture, transcription, analysis, Q&amp;A, task conversion; habit tracking, energy check-ins, coaching refresh, journal CRUD/trends, reflection-depth backfill, and leadership coaching sessions.</w:t>
             </w:r>
           </w:p>
         </w:tc>
@@ -983,7 +951,7 @@
         <w:spacing w:after="120"/>
       </w:pPr>
       <w:r>
-        <w:t>Important newer tables include push_subscriptions, notification_preferences, notification_delivery_logs, system_health_events, operations_issue_drafts, cto_reviews, cto_findings, home_dashboard_snapshots, audit_logs, and tasks.completed_at.</w:t>
+        <w:t>Important newer tables include meetings, meeting_attendees, meeting_context_notes, meeting_participants, meeting_transcript_segments, meeting_topics, meeting_decisions, meeting_action_items, meeting_leadership_observations, meeting_goal_links, meeting_project_links, push_subscriptions, notification_preferences, notification_delivery_logs, system_health_events, operations_issue_drafts, cto_reviews, cto_findings, home_dashboard_snapshots, audit_logs, and tasks.completed_at.</w:t>
       </w:r>
     </w:p>
     <w:p>
@@ -1008,7 +976,7 @@
         <w:spacing w:after="80"/>
       </w:pPr>
       <w:r>
-        <w:t>Home uses dashboard snapshots to route activated users into the most relevant next workflow.</w:t>
+        <w:t>Home uses dashboard snapshots to route activated users into the most relevant next workflow and presents normalized daily MTN, seven-day journal consistency, reflection depth, habits, energy, and 30-day behavioral trends.</w:t>
       </w:r>
     </w:p>
     <w:p>
@@ -1035,7 +1003,7 @@
         <w:spacing w:after="80"/>
       </w:pPr>
       <w:r>
-        <w:t>TodoList coordinates task data and uses focused modules for list rendering, page controls, MTN trends, modals, filtering, and selection state.</w:t>
+        <w:t>TodoList coordinates task data and uses focused modules for list/calendar rendering, page controls, MTN trends and history, drag-and-drop scheduling, modals, filtering, and selection state.</w:t>
       </w:r>
     </w:p>
     <w:p>
@@ -1772,6 +1740,79 @@
         <w:t>The LLM-facing documentation should continue to be updated whenever policy pages, mobile release mechanics, schema, or production release process changes.</w:t>
       </w:r>
     </w:p>
+    <w:p>
+      <w:pPr>
+        <w:pStyle w:val="Heading1"/>
+        <w:keepNext/>
+      </w:pPr>
+      <w:r>
+        <w:t>16. July 25, 2026 Product Update</w:t>
+      </w:r>
+    </w:p>
+    <w:p>
+      <w:pPr>
+        <w:pStyle w:val="ListBullet"/>
+      </w:pPr>
+      <w:r>
+        <w:t>My Meetings is now an active product surface for live recording, audio upload, or pasted notes. Processing produces a transcript, executive summary, topics, decisions, evidence-backed action items, and leadership observations.</w:t>
+      </w:r>
+    </w:p>
+    <w:p>
+      <w:pPr>
+        <w:pStyle w:val="ListBullet"/>
+      </w:pPr>
+      <w:r>
+        <w:t>Meeting intelligence now separates transcript analysis, action-item extraction, and leadership coaching; reuses saved transcripts on retry; retries transient database writes; and records stage-specific, user-safe failure references.</w:t>
+      </w:r>
+    </w:p>
+    <w:p>
+      <w:pPr>
+        <w:pStyle w:val="ListBullet"/>
+      </w:pPr>
+      <w:r>
+        <w:t>Meetings can automatically match known people and link active goals/projects at high confidence, while users can correct participant matches and add related work manually.</w:t>
+      </w:r>
+    </w:p>
+    <w:p>
+      <w:pPr>
+        <w:pStyle w:val="ListBullet"/>
+      </w:pPr>
+      <w:r>
+        <w:t>Meeting details include transcript search, recording controls, action-item conversion into personal or follow-up tasks, and an Ask Alfred chat scoped to the selected meeting.</w:t>
+      </w:r>
+    </w:p>
+    <w:p>
+      <w:pPr>
+        <w:pStyle w:val="ListBullet"/>
+      </w:pPr>
+      <w:r>
+        <w:t>The task calendar now supports day, week, and month views, drag-and-drop rescheduling, overdue handling, completed-task history, and daily MTN detail. The database uses tasks.due_date as the single scheduling field.</w:t>
+      </w:r>
+    </w:p>
+    <w:p>
+      <w:pPr>
+        <w:pStyle w:val="ListBullet"/>
+      </w:pPr>
+      <w:r>
+        <w:t>Home metrics now express journal consistency as days journaled in the last seven days and normalize daily MTN against the highest daily total in the visible period.</w:t>
+      </w:r>
+    </w:p>
+    <w:p>
+      <w:pPr>
+        <w:pStyle w:val="ListBullet"/>
+      </w:pPr>
+      <w:r>
+        <w:t>My Team now stores current and potential contribution values for sponsor-circle plotting.</w:t>
+      </w:r>
+    </w:p>
+    <w:p>
+      <w:pPr>
+        <w:pStyle w:val="ListBullet"/>
+      </w:pPr>
+      <w:r>
+        <w:t>Release and recovery checklists now include Meetings, the task calendar, meeting persistence, and the latest Alembic revisions.</w:t>
+      </w:r>
+    </w:p>
     <w:sectPr>
       <w:footerReference w:type="default" r:id="rId9"/>
       <w:pgSz w:w="12240" w:h="15840"/>

</xml_diff>